<commit_message>
Vantaca Payments: Stripe and office travel confirmed, score 82, resume and cover letter rebuilt; profile updated
Co-Authored-By: Claude Opus 5.5 <noreply@anthropic.com>
Claude-Session: https://claude.ai/code/session_01FBRQCEuHNbZjQ9zAhKMdjS
</commit_message>
<xml_diff>
--- a/applications/vantaca-implementation-consultant-payments/Vantaca-ImplementationConsultantPayments-Resume.docx
+++ b/applications/vantaca-implementation-consultant-payments/Vantaca-ImplementationConsultantPayments-Resume.docx
@@ -201,7 +201,7 @@
           <w:i w:val="0"/>
           <w:color w:val="1A1A1A"/>
         </w:rPr>
-        <w:t>Build and debug production automations in Zapier, Make, n8n, and GoHighLevel, configuring webhooks, REST API calls, and OAuth/API-key credentials and resolving integration errors directly.</w:t>
+        <w:t>Build and debug production automations in Zapier, Make, n8n, and GoHighLevel, plus Stripe payment setup, configuring webhooks, REST API calls, and OAuth/API-key credentials and resolving integration errors directly.</w:t>
       </w:r>
     </w:p>
     <w:p>
@@ -721,7 +721,7 @@
           <w:i w:val="0"/>
           <w:color w:val="1A1A1A"/>
         </w:rPr>
-        <w:t>HubSpot, Salesforce, Asana, GoHighLevel</w:t>
+        <w:t>Stripe, HubSpot, Salesforce, Asana, GoHighLevel</w:t>
       </w:r>
     </w:p>
     <w:p>

</xml_diff>